<commit_message>
Add cw and minor fixes
</commit_message>
<xml_diff>
--- a/tsrts/cw/coursework.docx
+++ b/tsrts/cw/coursework.docx
@@ -887,44 +887,44 @@
         <w:pStyle w:val="1"/>
         <w:ind w:left="0" w:right="1041"/>
       </w:pPr>
-      <w:bookmarkStart w:id="0" w:name="_Toc208186398"/>
+      <w:bookmarkStart w:id="0" w:name="_Toc213703611"/>
       <w:r>
         <w:rPr>
           <w:spacing w:val="-2"/>
         </w:rPr>
         <w:t>ЗАДАНИЕ</w:t>
       </w:r>
+      <w:r>
+        <w:rPr>
+          <w:spacing w:val="-2"/>
+        </w:rPr>
+        <w:t xml:space="preserve"> </w:t>
+      </w:r>
+      <w:r>
+        <w:t>НА</w:t>
+      </w:r>
+      <w:r>
+        <w:rPr>
+          <w:spacing w:val="-4"/>
+        </w:rPr>
+        <w:t xml:space="preserve"> </w:t>
+      </w:r>
+      <w:r>
+        <w:t>КУРСОВУЮ</w:t>
+      </w:r>
+      <w:r>
+        <w:rPr>
+          <w:spacing w:val="-1"/>
+        </w:rPr>
+        <w:t xml:space="preserve"> </w:t>
+      </w:r>
+      <w:r>
+        <w:rPr>
+          <w:spacing w:val="-2"/>
+        </w:rPr>
+        <w:t>РАБОТУ</w:t>
+      </w:r>
       <w:bookmarkEnd w:id="0"/>
-      <w:r>
-        <w:rPr>
-          <w:spacing w:val="-2"/>
-        </w:rPr>
-        <w:t xml:space="preserve"> </w:t>
-      </w:r>
-      <w:r>
-        <w:t>НА</w:t>
-      </w:r>
-      <w:r>
-        <w:rPr>
-          <w:spacing w:val="-4"/>
-        </w:rPr>
-        <w:t xml:space="preserve"> </w:t>
-      </w:r>
-      <w:r>
-        <w:t>КУРСОВУЮ</w:t>
-      </w:r>
-      <w:r>
-        <w:rPr>
-          <w:spacing w:val="-1"/>
-        </w:rPr>
-        <w:t xml:space="preserve"> </w:t>
-      </w:r>
-      <w:r>
-        <w:rPr>
-          <w:spacing w:val="-2"/>
-        </w:rPr>
-        <w:t>РАБОТУ</w:t>
-      </w:r>
     </w:p>
     <w:p>
       <w:pPr>
@@ -2026,7 +2026,7 @@
           <w:spacing w:val="-2"/>
         </w:rPr>
       </w:pPr>
-      <w:bookmarkStart w:id="1" w:name="_Toc208186399"/>
+      <w:bookmarkStart w:id="1" w:name="_Toc213703612"/>
       <w:r>
         <w:rPr>
           <w:spacing w:val="-2"/>
@@ -2068,7 +2068,10 @@
             <w:pStyle w:val="11"/>
             <w:rPr>
               <w:rFonts w:asciiTheme="minorHAnsi" w:eastAsiaTheme="minorEastAsia" w:hAnsiTheme="minorHAnsi" w:cstheme="minorBidi"/>
+              <w:kern w:val="2"/>
+              <w:sz w:val="22"/>
               <w:lang w:eastAsia="ru-RU"/>
+              <w14:ligatures w14:val="standardContextual"/>
             </w:rPr>
           </w:pPr>
           <w:r>
@@ -2080,13 +2083,46 @@
           <w:r>
             <w:fldChar w:fldCharType="separate"/>
           </w:r>
-          <w:hyperlink w:anchor="_Toc208186398" w:history="1">
+          <w:hyperlink w:anchor="_Toc213703611" w:history="1">
             <w:r>
               <w:rPr>
                 <w:rStyle w:val="ac"/>
                 <w:spacing w:val="-2"/>
               </w:rPr>
-              <w:t>ЗАДАНИЕ</w:t>
+              <w:t xml:space="preserve">ЗАДАНИЕ </w:t>
+            </w:r>
+            <w:r>
+              <w:rPr>
+                <w:rStyle w:val="ac"/>
+              </w:rPr>
+              <w:t>НА</w:t>
+            </w:r>
+            <w:r>
+              <w:rPr>
+                <w:rStyle w:val="ac"/>
+                <w:spacing w:val="-4"/>
+              </w:rPr>
+              <w:t xml:space="preserve"> </w:t>
+            </w:r>
+            <w:r>
+              <w:rPr>
+                <w:rStyle w:val="ac"/>
+              </w:rPr>
+              <w:t>КУРСОВУЮ</w:t>
+            </w:r>
+            <w:r>
+              <w:rPr>
+                <w:rStyle w:val="ac"/>
+                <w:spacing w:val="-1"/>
+              </w:rPr>
+              <w:t xml:space="preserve"> </w:t>
+            </w:r>
+            <w:r>
+              <w:rPr>
+                <w:rStyle w:val="ac"/>
+                <w:spacing w:val="-2"/>
+              </w:rPr>
+              <w:t>РАБОТУ</w:t>
             </w:r>
             <w:r>
               <w:rPr>
@@ -2104,7 +2140,7 @@
               <w:rPr>
                 <w:webHidden/>
               </w:rPr>
-              <w:instrText xml:space="preserve"> PAGEREF _Toc208186398 \h </w:instrText>
+              <w:instrText xml:space="preserve"> PAGEREF _Toc213703611 \h </w:instrText>
             </w:r>
             <w:r>
               <w:rPr>
@@ -2136,10 +2172,13 @@
             <w:pStyle w:val="11"/>
             <w:rPr>
               <w:rFonts w:asciiTheme="minorHAnsi" w:eastAsiaTheme="minorEastAsia" w:hAnsiTheme="minorHAnsi" w:cstheme="minorBidi"/>
+              <w:kern w:val="2"/>
+              <w:sz w:val="22"/>
               <w:lang w:eastAsia="ru-RU"/>
+              <w14:ligatures w14:val="standardContextual"/>
             </w:rPr>
           </w:pPr>
-          <w:hyperlink w:anchor="_Toc208186399" w:history="1">
+          <w:hyperlink w:anchor="_Toc213703612" w:history="1">
             <w:r>
               <w:rPr>
                 <w:rStyle w:val="ac"/>
@@ -2163,7 +2202,7 @@
               <w:rPr>
                 <w:webHidden/>
               </w:rPr>
-              <w:instrText xml:space="preserve"> PAGEREF _Toc208186399 \h </w:instrText>
+              <w:instrText xml:space="preserve"> PAGEREF _Toc213703612 \h </w:instrText>
             </w:r>
             <w:r>
               <w:rPr>
@@ -2195,10 +2234,13 @@
             <w:pStyle w:val="11"/>
             <w:rPr>
               <w:rFonts w:asciiTheme="minorHAnsi" w:eastAsiaTheme="minorEastAsia" w:hAnsiTheme="minorHAnsi" w:cstheme="minorBidi"/>
+              <w:kern w:val="2"/>
+              <w:sz w:val="22"/>
               <w:lang w:eastAsia="ru-RU"/>
+              <w14:ligatures w14:val="standardContextual"/>
             </w:rPr>
           </w:pPr>
-          <w:hyperlink w:anchor="_Toc208186400" w:history="1">
+          <w:hyperlink w:anchor="_Toc213703613" w:history="1">
             <w:r>
               <w:rPr>
                 <w:rStyle w:val="ac"/>
@@ -2222,7 +2264,7 @@
               <w:rPr>
                 <w:webHidden/>
               </w:rPr>
-              <w:instrText xml:space="preserve"> PAGEREF _Toc208186400 \h </w:instrText>
+              <w:instrText xml:space="preserve"> PAGEREF _Toc213703613 \h </w:instrText>
             </w:r>
             <w:r>
               <w:rPr>
@@ -2254,10 +2296,13 @@
             <w:pStyle w:val="11"/>
             <w:rPr>
               <w:rFonts w:asciiTheme="minorHAnsi" w:eastAsiaTheme="minorEastAsia" w:hAnsiTheme="minorHAnsi" w:cstheme="minorBidi"/>
+              <w:kern w:val="2"/>
+              <w:sz w:val="22"/>
               <w:lang w:eastAsia="ru-RU"/>
+              <w14:ligatures w14:val="standardContextual"/>
             </w:rPr>
           </w:pPr>
-          <w:hyperlink w:anchor="_Toc208186401" w:history="1">
+          <w:hyperlink w:anchor="_Toc213703614" w:history="1">
             <w:r>
               <w:rPr>
                 <w:rStyle w:val="ac"/>
@@ -2267,7 +2312,10 @@
             <w:r>
               <w:rPr>
                 <w:rFonts w:asciiTheme="minorHAnsi" w:eastAsiaTheme="minorEastAsia" w:hAnsiTheme="minorHAnsi" w:cstheme="minorBidi"/>
+                <w:kern w:val="2"/>
+                <w:sz w:val="22"/>
                 <w:lang w:eastAsia="ru-RU"/>
+                <w14:ligatures w14:val="standardContextual"/>
               </w:rPr>
               <w:tab/>
             </w:r>
@@ -2320,7 +2368,7 @@
               <w:rPr>
                 <w:webHidden/>
               </w:rPr>
-              <w:instrText xml:space="preserve"> PAGEREF _Toc208186401 \h </w:instrText>
+              <w:instrText xml:space="preserve"> PAGEREF _Toc213703614 \h </w:instrText>
             </w:r>
             <w:r>
               <w:rPr>
@@ -2352,10 +2400,13 @@
             <w:pStyle w:val="11"/>
             <w:rPr>
               <w:rFonts w:asciiTheme="minorHAnsi" w:eastAsiaTheme="minorEastAsia" w:hAnsiTheme="minorHAnsi" w:cstheme="minorBidi"/>
+              <w:kern w:val="2"/>
+              <w:sz w:val="22"/>
               <w:lang w:eastAsia="ru-RU"/>
+              <w14:ligatures w14:val="standardContextual"/>
             </w:rPr>
           </w:pPr>
-          <w:hyperlink w:anchor="_Toc208186402" w:history="1">
+          <w:hyperlink w:anchor="_Toc213703615" w:history="1">
             <w:r>
               <w:rPr>
                 <w:rStyle w:val="ac"/>
@@ -2365,7 +2416,10 @@
             <w:r>
               <w:rPr>
                 <w:rFonts w:asciiTheme="minorHAnsi" w:eastAsiaTheme="minorEastAsia" w:hAnsiTheme="minorHAnsi" w:cstheme="minorBidi"/>
+                <w:kern w:val="2"/>
+                <w:sz w:val="22"/>
                 <w:lang w:eastAsia="ru-RU"/>
+                <w14:ligatures w14:val="standardContextual"/>
               </w:rPr>
               <w:tab/>
             </w:r>
@@ -2373,47 +2427,7 @@
               <w:rPr>
                 <w:rStyle w:val="ac"/>
               </w:rPr>
-              <w:t>ФУНКЦИОНАЛЬНАЯ</w:t>
-            </w:r>
-            <w:r>
-              <w:rPr>
-                <w:rStyle w:val="ac"/>
-                <w:spacing w:val="-10"/>
-              </w:rPr>
-              <w:t xml:space="preserve"> </w:t>
-            </w:r>
-            <w:r>
-              <w:rPr>
-                <w:rStyle w:val="ac"/>
-              </w:rPr>
-              <w:t>СХЕМА</w:t>
-            </w:r>
-            <w:r>
-              <w:rPr>
-                <w:rStyle w:val="ac"/>
-                <w:spacing w:val="-7"/>
-              </w:rPr>
-              <w:t xml:space="preserve"> </w:t>
-            </w:r>
-            <w:r>
-              <w:rPr>
-                <w:rStyle w:val="ac"/>
-              </w:rPr>
-              <w:t>СЛЕДЯЩЕЙ</w:t>
-            </w:r>
-            <w:r>
-              <w:rPr>
-                <w:rStyle w:val="ac"/>
-                <w:spacing w:val="-3"/>
-              </w:rPr>
-              <w:t xml:space="preserve"> </w:t>
-            </w:r>
-            <w:r>
-              <w:rPr>
-                <w:rStyle w:val="ac"/>
-                <w:spacing w:val="-2"/>
-              </w:rPr>
-              <w:t>СИСТЕМЫ</w:t>
+              <w:t>ФУНКЦИОНАЛЬНАЯ СХЕМА СЛЕДЯЩЕЙ СИСТЕМЫ</w:t>
             </w:r>
             <w:r>
               <w:rPr>
@@ -2431,7 +2445,7 @@
               <w:rPr>
                 <w:webHidden/>
               </w:rPr>
-              <w:instrText xml:space="preserve"> PAGEREF _Toc208186402 \h </w:instrText>
+              <w:instrText xml:space="preserve"> PAGEREF _Toc213703615 \h </w:instrText>
             </w:r>
             <w:r>
               <w:rPr>
@@ -2463,10 +2477,13 @@
             <w:pStyle w:val="11"/>
             <w:rPr>
               <w:rFonts w:asciiTheme="minorHAnsi" w:eastAsiaTheme="minorEastAsia" w:hAnsiTheme="minorHAnsi" w:cstheme="minorBidi"/>
+              <w:kern w:val="2"/>
+              <w:sz w:val="22"/>
               <w:lang w:eastAsia="ru-RU"/>
+              <w14:ligatures w14:val="standardContextual"/>
             </w:rPr>
           </w:pPr>
-          <w:hyperlink w:anchor="_Toc208186403" w:history="1">
+          <w:hyperlink w:anchor="_Toc213703616" w:history="1">
             <w:r>
               <w:rPr>
                 <w:rStyle w:val="ac"/>
@@ -2476,7 +2493,10 @@
             <w:r>
               <w:rPr>
                 <w:rFonts w:asciiTheme="minorHAnsi" w:eastAsiaTheme="minorEastAsia" w:hAnsiTheme="minorHAnsi" w:cstheme="minorBidi"/>
+                <w:kern w:val="2"/>
+                <w:sz w:val="22"/>
                 <w:lang w:eastAsia="ru-RU"/>
+                <w14:ligatures w14:val="standardContextual"/>
               </w:rPr>
               <w:tab/>
             </w:r>
@@ -2484,59 +2504,7 @@
               <w:rPr>
                 <w:rStyle w:val="ac"/>
               </w:rPr>
-              <w:t>ВЫБОР</w:t>
-            </w:r>
-            <w:r>
-              <w:rPr>
-                <w:rStyle w:val="ac"/>
-                <w:spacing w:val="-9"/>
-              </w:rPr>
-              <w:t xml:space="preserve"> </w:t>
-            </w:r>
-            <w:r>
-              <w:rPr>
-                <w:rStyle w:val="ac"/>
-              </w:rPr>
-              <w:t>ИСПОЛНИТЕЛЬНОГО</w:t>
-            </w:r>
-            <w:r>
-              <w:rPr>
-                <w:rStyle w:val="ac"/>
-                <w:spacing w:val="-11"/>
-              </w:rPr>
-              <w:t xml:space="preserve"> </w:t>
-            </w:r>
-            <w:r>
-              <w:rPr>
-                <w:rStyle w:val="ac"/>
-              </w:rPr>
-              <w:t>ДВИГАТЕЛЯ</w:t>
-            </w:r>
-            <w:r>
-              <w:rPr>
-                <w:rStyle w:val="ac"/>
-                <w:spacing w:val="-10"/>
-              </w:rPr>
-              <w:t xml:space="preserve"> </w:t>
-            </w:r>
-            <w:r>
-              <w:rPr>
-                <w:rStyle w:val="ac"/>
-              </w:rPr>
-              <w:t>И</w:t>
-            </w:r>
-            <w:r>
-              <w:rPr>
-                <w:rStyle w:val="ac"/>
-                <w:spacing w:val="-6"/>
-              </w:rPr>
-              <w:t xml:space="preserve"> </w:t>
-            </w:r>
-            <w:r>
-              <w:rPr>
-                <w:rStyle w:val="ac"/>
-              </w:rPr>
-              <w:t>РЕДУКТОРА СЛЕДЯЩЕЙ СИСТЕМЫ</w:t>
+              <w:t>ВЫБОР ИСПОЛНИТЕЛЬНОГО ДВИГАТЕЛЯ И РЕДУКТОРА СЛЕДЯЩЕЙ СИСТЕМЫ</w:t>
             </w:r>
             <w:r>
               <w:rPr>
@@ -2554,7 +2522,7 @@
               <w:rPr>
                 <w:webHidden/>
               </w:rPr>
-              <w:instrText xml:space="preserve"> PAGEREF _Toc208186403 \h </w:instrText>
+              <w:instrText xml:space="preserve"> PAGEREF _Toc213703616 \h </w:instrText>
             </w:r>
             <w:r>
               <w:rPr>
@@ -2571,7 +2539,7 @@
               <w:rPr>
                 <w:webHidden/>
               </w:rPr>
-              <w:t>8</w:t>
+              <w:t>7</w:t>
             </w:r>
             <w:r>
               <w:rPr>
@@ -2586,10 +2554,13 @@
             <w:pStyle w:val="11"/>
             <w:rPr>
               <w:rFonts w:asciiTheme="minorHAnsi" w:eastAsiaTheme="minorEastAsia" w:hAnsiTheme="minorHAnsi" w:cstheme="minorBidi"/>
+              <w:kern w:val="2"/>
+              <w:sz w:val="22"/>
               <w:lang w:eastAsia="ru-RU"/>
+              <w14:ligatures w14:val="standardContextual"/>
             </w:rPr>
           </w:pPr>
-          <w:hyperlink w:anchor="_Toc208186404" w:history="1">
+          <w:hyperlink w:anchor="_Toc213703617" w:history="1">
             <w:r>
               <w:rPr>
                 <w:rStyle w:val="ac"/>
@@ -2599,7 +2570,10 @@
             <w:r>
               <w:rPr>
                 <w:rFonts w:asciiTheme="minorHAnsi" w:eastAsiaTheme="minorEastAsia" w:hAnsiTheme="minorHAnsi" w:cstheme="minorBidi"/>
+                <w:kern w:val="2"/>
+                <w:sz w:val="22"/>
                 <w:lang w:eastAsia="ru-RU"/>
+                <w14:ligatures w14:val="standardContextual"/>
               </w:rPr>
               <w:tab/>
             </w:r>
@@ -2607,7 +2581,7 @@
               <w:rPr>
                 <w:rStyle w:val="ac"/>
               </w:rPr>
-              <w:t>ВЫЮОР ЧУВСТВИТЕЛЬНОГО ЭЛЕМЕНТА</w:t>
+              <w:t>ВЫБОР ЧУВСТВИТЕЛЬНОГО ЭЛЕМЕНТА – ДАТЧИКА ОБРАТНОЙ СВЯЗИ</w:t>
             </w:r>
             <w:r>
               <w:rPr>
@@ -2625,7 +2599,7 @@
               <w:rPr>
                 <w:webHidden/>
               </w:rPr>
-              <w:instrText xml:space="preserve"> PAGEREF _Toc208186404 \h </w:instrText>
+              <w:instrText xml:space="preserve"> PAGEREF _Toc213703617 \h </w:instrText>
             </w:r>
             <w:r>
               <w:rPr>
@@ -2642,7 +2616,7 @@
               <w:rPr>
                 <w:webHidden/>
               </w:rPr>
-              <w:t>13</w:t>
+              <w:t>12</w:t>
             </w:r>
             <w:r>
               <w:rPr>
@@ -2657,10 +2631,13 @@
             <w:pStyle w:val="11"/>
             <w:rPr>
               <w:rFonts w:asciiTheme="minorHAnsi" w:eastAsiaTheme="minorEastAsia" w:hAnsiTheme="minorHAnsi" w:cstheme="minorBidi"/>
+              <w:kern w:val="2"/>
+              <w:sz w:val="22"/>
               <w:lang w:eastAsia="ru-RU"/>
+              <w14:ligatures w14:val="standardContextual"/>
             </w:rPr>
           </w:pPr>
-          <w:hyperlink w:anchor="_Toc208186405" w:history="1">
+          <w:hyperlink w:anchor="_Toc213703618" w:history="1">
             <w:r>
               <w:rPr>
                 <w:rStyle w:val="ac"/>
@@ -2670,7 +2647,10 @@
             <w:r>
               <w:rPr>
                 <w:rFonts w:asciiTheme="minorHAnsi" w:eastAsiaTheme="minorEastAsia" w:hAnsiTheme="minorHAnsi" w:cstheme="minorBidi"/>
+                <w:kern w:val="2"/>
+                <w:sz w:val="22"/>
                 <w:lang w:eastAsia="ru-RU"/>
+                <w14:ligatures w14:val="standardContextual"/>
               </w:rPr>
               <w:tab/>
             </w:r>
@@ -2729,7 +2709,7 @@
               <w:rPr>
                 <w:webHidden/>
               </w:rPr>
-              <w:instrText xml:space="preserve"> PAGEREF _Toc208186405 \h </w:instrText>
+              <w:instrText xml:space="preserve"> PAGEREF _Toc213703618 \h </w:instrText>
             </w:r>
             <w:r>
               <w:rPr>
@@ -2746,7 +2726,7 @@
               <w:rPr>
                 <w:webHidden/>
               </w:rPr>
-              <w:t>16</w:t>
+              <w:t>15</w:t>
             </w:r>
             <w:r>
               <w:rPr>
@@ -2761,10 +2741,13 @@
             <w:pStyle w:val="11"/>
             <w:rPr>
               <w:rFonts w:asciiTheme="minorHAnsi" w:eastAsiaTheme="minorEastAsia" w:hAnsiTheme="minorHAnsi" w:cstheme="minorBidi"/>
+              <w:kern w:val="2"/>
+              <w:sz w:val="22"/>
               <w:lang w:eastAsia="ru-RU"/>
+              <w14:ligatures w14:val="standardContextual"/>
             </w:rPr>
           </w:pPr>
-          <w:hyperlink w:anchor="_Toc208186406" w:history="1">
+          <w:hyperlink w:anchor="_Toc213703619" w:history="1">
             <w:r>
               <w:rPr>
                 <w:rStyle w:val="ac"/>
@@ -2774,7 +2757,10 @@
             <w:r>
               <w:rPr>
                 <w:rFonts w:asciiTheme="minorHAnsi" w:eastAsiaTheme="minorEastAsia" w:hAnsiTheme="minorHAnsi" w:cstheme="minorBidi"/>
+                <w:kern w:val="2"/>
+                <w:sz w:val="22"/>
                 <w:lang w:eastAsia="ru-RU"/>
+                <w14:ligatures w14:val="standardContextual"/>
               </w:rPr>
               <w:tab/>
             </w:r>
@@ -2833,7 +2819,7 @@
               <w:rPr>
                 <w:webHidden/>
               </w:rPr>
-              <w:instrText xml:space="preserve"> PAGEREF _Toc208186406 \h </w:instrText>
+              <w:instrText xml:space="preserve"> PAGEREF _Toc213703619 \h </w:instrText>
             </w:r>
             <w:r>
               <w:rPr>
@@ -2850,7 +2836,7 @@
               <w:rPr>
                 <w:webHidden/>
               </w:rPr>
-              <w:t>19</w:t>
+              <w:t>18</w:t>
             </w:r>
             <w:r>
               <w:rPr>
@@ -2865,10 +2851,13 @@
             <w:pStyle w:val="11"/>
             <w:rPr>
               <w:rFonts w:asciiTheme="minorHAnsi" w:eastAsiaTheme="minorEastAsia" w:hAnsiTheme="minorHAnsi" w:cstheme="minorBidi"/>
+              <w:kern w:val="2"/>
+              <w:sz w:val="22"/>
               <w:lang w:eastAsia="ru-RU"/>
+              <w14:ligatures w14:val="standardContextual"/>
             </w:rPr>
           </w:pPr>
-          <w:hyperlink w:anchor="_Toc208186407" w:history="1">
+          <w:hyperlink w:anchor="_Toc213703620" w:history="1">
             <w:r>
               <w:rPr>
                 <w:rStyle w:val="ac"/>
@@ -2878,7 +2867,10 @@
             <w:r>
               <w:rPr>
                 <w:rFonts w:asciiTheme="minorHAnsi" w:eastAsiaTheme="minorEastAsia" w:hAnsiTheme="minorHAnsi" w:cstheme="minorBidi"/>
+                <w:kern w:val="2"/>
+                <w:sz w:val="22"/>
                 <w:lang w:eastAsia="ru-RU"/>
+                <w14:ligatures w14:val="standardContextual"/>
               </w:rPr>
               <w:tab/>
             </w:r>
@@ -2963,7 +2955,7 @@
               <w:rPr>
                 <w:webHidden/>
               </w:rPr>
-              <w:instrText xml:space="preserve"> PAGEREF _Toc208186407 \h </w:instrText>
+              <w:instrText xml:space="preserve"> PAGEREF _Toc213703620 \h </w:instrText>
             </w:r>
             <w:r>
               <w:rPr>
@@ -2980,7 +2972,7 @@
               <w:rPr>
                 <w:webHidden/>
               </w:rPr>
-              <w:t>24</w:t>
+              <w:t>22</w:t>
             </w:r>
             <w:r>
               <w:rPr>
@@ -2995,10 +2987,13 @@
             <w:pStyle w:val="11"/>
             <w:rPr>
               <w:rFonts w:asciiTheme="minorHAnsi" w:eastAsiaTheme="minorEastAsia" w:hAnsiTheme="minorHAnsi" w:cstheme="minorBidi"/>
+              <w:kern w:val="2"/>
+              <w:sz w:val="22"/>
               <w:lang w:eastAsia="ru-RU"/>
+              <w14:ligatures w14:val="standardContextual"/>
             </w:rPr>
           </w:pPr>
-          <w:hyperlink w:anchor="_Toc208186408" w:history="1">
+          <w:hyperlink w:anchor="_Toc213703621" w:history="1">
             <w:r>
               <w:rPr>
                 <w:rStyle w:val="ac"/>
@@ -3021,7 +3016,7 @@
               <w:rPr>
                 <w:webHidden/>
               </w:rPr>
-              <w:instrText xml:space="preserve"> PAGEREF _Toc208186408 \h </w:instrText>
+              <w:instrText xml:space="preserve"> PAGEREF _Toc213703621 \h </w:instrText>
             </w:r>
             <w:r>
               <w:rPr>
@@ -3038,7 +3033,7 @@
               <w:rPr>
                 <w:webHidden/>
               </w:rPr>
-              <w:t>26</w:t>
+              <w:t>24</w:t>
             </w:r>
             <w:r>
               <w:rPr>
@@ -3053,10 +3048,13 @@
             <w:pStyle w:val="11"/>
             <w:rPr>
               <w:rFonts w:asciiTheme="minorHAnsi" w:eastAsiaTheme="minorEastAsia" w:hAnsiTheme="minorHAnsi" w:cstheme="minorBidi"/>
+              <w:kern w:val="2"/>
+              <w:sz w:val="22"/>
               <w:lang w:eastAsia="ru-RU"/>
+              <w14:ligatures w14:val="standardContextual"/>
             </w:rPr>
           </w:pPr>
-          <w:hyperlink w:anchor="_Toc208186409" w:history="1">
+          <w:hyperlink w:anchor="_Toc213703622" w:history="1">
             <w:r>
               <w:rPr>
                 <w:rStyle w:val="ac"/>
@@ -3079,7 +3077,7 @@
               <w:rPr>
                 <w:webHidden/>
               </w:rPr>
-              <w:instrText xml:space="preserve"> PAGEREF _Toc208186409 \h </w:instrText>
+              <w:instrText xml:space="preserve"> PAGEREF _Toc213703622 \h </w:instrText>
             </w:r>
             <w:r>
               <w:rPr>
@@ -3096,7 +3094,68 @@
               <w:rPr>
                 <w:webHidden/>
               </w:rPr>
-              <w:t>27</w:t>
+              <w:t>25</w:t>
+            </w:r>
+            <w:r>
+              <w:rPr>
+                <w:webHidden/>
+              </w:rPr>
+              <w:fldChar w:fldCharType="end"/>
+            </w:r>
+          </w:hyperlink>
+        </w:p>
+        <w:p>
+          <w:pPr>
+            <w:pStyle w:val="11"/>
+            <w:rPr>
+              <w:rFonts w:asciiTheme="minorHAnsi" w:eastAsiaTheme="minorEastAsia" w:hAnsiTheme="minorHAnsi" w:cstheme="minorBidi"/>
+              <w:kern w:val="2"/>
+              <w:sz w:val="22"/>
+              <w:lang w:eastAsia="ru-RU"/>
+              <w14:ligatures w14:val="standardContextual"/>
+            </w:rPr>
+          </w:pPr>
+          <w:hyperlink w:anchor="_Toc213703623" w:history="1">
+            <w:r>
+              <w:rPr>
+                <w:rStyle w:val="ac"/>
+              </w:rPr>
+              <w:t>ПРИЛОЖЕНИЕ</w:t>
+            </w:r>
+            <w:r>
+              <w:rPr>
+                <w:webHidden/>
+              </w:rPr>
+              <w:tab/>
+            </w:r>
+            <w:r>
+              <w:rPr>
+                <w:webHidden/>
+              </w:rPr>
+              <w:fldChar w:fldCharType="begin"/>
+            </w:r>
+            <w:r>
+              <w:rPr>
+                <w:webHidden/>
+              </w:rPr>
+              <w:instrText xml:space="preserve"> PAGEREF _Toc213703623 \h </w:instrText>
+            </w:r>
+            <w:r>
+              <w:rPr>
+                <w:webHidden/>
+              </w:rPr>
+            </w:r>
+            <w:r>
+              <w:rPr>
+                <w:webHidden/>
+              </w:rPr>
+              <w:fldChar w:fldCharType="separate"/>
+            </w:r>
+            <w:r>
+              <w:rPr>
+                <w:webHidden/>
+              </w:rPr>
+              <w:t>26</w:t>
             </w:r>
             <w:r>
               <w:rPr>
@@ -3162,12 +3221,11 @@
           <w:spacing w:val="-2"/>
         </w:rPr>
       </w:pPr>
-      <w:bookmarkStart w:id="2" w:name="_Toc208186400"/>
+      <w:bookmarkStart w:id="2" w:name="_Toc213703613"/>
       <w:r>
         <w:rPr>
           <w:spacing w:val="-2"/>
         </w:rPr>
-        <w:lastRenderedPageBreak/>
         <w:t>ВВЕДЕНИЕ</w:t>
       </w:r>
       <w:bookmarkEnd w:id="2"/>
@@ -3353,7 +3411,7 @@
         <w:ind w:left="0" w:firstLine="0"/>
         <w:jc w:val="center"/>
       </w:pPr>
-      <w:bookmarkStart w:id="3" w:name="_Toc208186401"/>
+      <w:bookmarkStart w:id="3" w:name="_Toc213703614"/>
       <w:r>
         <w:t>ЗАДАНИЕ</w:t>
       </w:r>
@@ -4339,9 +4397,8 @@
         <w:contextualSpacing/>
         <w:jc w:val="center"/>
       </w:pPr>
-      <w:bookmarkStart w:id="4" w:name="_Toc208186402"/>
-      <w:r>
-        <w:lastRenderedPageBreak/>
+      <w:bookmarkStart w:id="4" w:name="_Toc213703615"/>
+      <w:r>
         <w:t>ФУНКЦИОНАЛЬНАЯ СХЕМА СЛЕДЯЩЕЙ СИСТЕМЫ</w:t>
       </w:r>
       <w:bookmarkEnd w:id="4"/>
@@ -5587,9 +5644,8 @@
         <w:contextualSpacing/>
         <w:jc w:val="center"/>
       </w:pPr>
-      <w:bookmarkStart w:id="6" w:name="_Toc208186403"/>
-      <w:r>
-        <w:lastRenderedPageBreak/>
+      <w:bookmarkStart w:id="6" w:name="_Toc213703616"/>
+      <w:r>
         <w:t>ВЫБОР ИСПОЛНИТЕЛЬНОГО ДВИГАТЕЛЯ И РЕДУКТОРА СЛЕДЯЩЕЙ СИСТЕМЫ</w:t>
       </w:r>
       <w:bookmarkEnd w:id="6"/>
@@ -7016,6 +7072,7 @@
         <w:rPr>
           <w:noProof/>
         </w:rPr>
+        <w:lastRenderedPageBreak/>
         <w:drawing>
           <wp:inline distT="0" distB="0" distL="0" distR="0" wp14:anchorId="3672B455" wp14:editId="697CE6EF">
             <wp:extent cx="5162550" cy="1571625"/>
@@ -7138,7 +7195,6 @@
           <w:sz w:val="28"/>
           <w:szCs w:val="28"/>
         </w:rPr>
-        <w:lastRenderedPageBreak/>
         <w:t>Переведем с</w:t>
       </w:r>
       <w:r>
@@ -7528,7 +7584,8 @@
                 <m:sSubPr>
                   <m:ctrlPr>
                     <w:rPr>
-                      <w:rFonts w:ascii="Cambria Math" w:eastAsiaTheme="minorHAnsi" w:hAnsi="Cambria Math"/>
+                      <w:rFonts w:ascii="Cambria Math" w:eastAsiaTheme="minorHAnsi" w:hAnsi="Cambria Math" w:cs="Cambria Math"/>
+                      <w:i/>
                       <w:sz w:val="28"/>
                       <w:szCs w:val="28"/>
                     </w:rPr>
@@ -7537,18 +7594,15 @@
                 <m:e>
                   <m:r>
                     <w:rPr>
-                      <w:rFonts w:ascii="Cambria Math" w:eastAsiaTheme="minorHAnsi" w:hAnsi="Cambria Math"/>
+                      <w:rFonts w:ascii="Cambria Math" w:eastAsiaTheme="minorHAnsi" w:hAnsi="Cambria Math" w:cs="Cambria Math"/>
                       <w:sz w:val="28"/>
                       <w:szCs w:val="28"/>
                     </w:rPr>
-                    <m:t>n</m:t>
+                    <m:t>ω</m:t>
                   </m:r>
                 </m:e>
                 <m:sub>
                   <m:r>
-                    <m:rPr>
-                      <m:sty m:val="p"/>
-                    </m:rPr>
                     <w:rPr>
                       <w:rFonts w:ascii="Cambria Math" w:eastAsiaTheme="minorHAnsi" w:hAnsi="Cambria Math"/>
                       <w:sz w:val="28"/>
@@ -8608,6 +8662,7 @@
           <w:sz w:val="28"/>
           <w:szCs w:val="28"/>
         </w:rPr>
+        <w:lastRenderedPageBreak/>
         <w:t>𝐷</w:t>
       </w:r>
       <w:r>
@@ -13456,6 +13511,7 @@
           <w:sz w:val="28"/>
           <w:szCs w:val="28"/>
         </w:rPr>
+        <w:lastRenderedPageBreak/>
         <w:t>Проверка выбранного двигателя на нагрев. По данным двигателя (</w:t>
       </w:r>
       <w:r>
@@ -14683,7 +14739,6 @@
           <w:sz w:val="28"/>
           <w:szCs w:val="28"/>
         </w:rPr>
-        <w:lastRenderedPageBreak/>
         <w:t xml:space="preserve">Условием работоспособности выбранного двигателя является </w:t>
       </w:r>
       <w:r>
@@ -16438,6 +16493,7 @@
           <w:sz w:val="28"/>
           <w:szCs w:val="28"/>
         </w:rPr>
+        <w:lastRenderedPageBreak/>
         <w:t xml:space="preserve">Коэффициент передачи двигателя </w:t>
       </w:r>
       <w:r>
@@ -17286,7 +17342,6 @@
           <w:sz w:val="28"/>
           <w:szCs w:val="28"/>
         </w:rPr>
-        <w:lastRenderedPageBreak/>
         <w:t>Таким образом, передаточная функция двигателя:</w:t>
       </w:r>
     </w:p>
@@ -17468,68 +17523,11 @@
         <w:jc w:val="center"/>
       </w:pPr>
       <w:bookmarkStart w:id="7" w:name="4._Выбор_чувствительного_элемента_–_датч"/>
-      <w:bookmarkStart w:id="8" w:name="_Toc208186404"/>
+      <w:bookmarkStart w:id="8" w:name="_Toc213703617"/>
       <w:bookmarkEnd w:id="7"/>
       <w:r>
         <w:lastRenderedPageBreak/>
-        <w:t>Выбор</w:t>
-      </w:r>
-      <w:r>
-        <w:rPr>
-          <w:spacing w:val="-9"/>
-        </w:rPr>
-        <w:t xml:space="preserve"> </w:t>
-      </w:r>
-      <w:r>
-        <w:t>чувствительного</w:t>
-      </w:r>
-      <w:r>
-        <w:rPr>
-          <w:spacing w:val="-6"/>
-        </w:rPr>
-        <w:t xml:space="preserve"> </w:t>
-      </w:r>
-      <w:r>
-        <w:t>элемента</w:t>
-      </w:r>
-      <w:r>
-        <w:rPr>
-          <w:spacing w:val="-2"/>
-        </w:rPr>
-        <w:t xml:space="preserve"> </w:t>
-      </w:r>
-      <w:r>
-        <w:t>–</w:t>
-      </w:r>
-      <w:r>
-        <w:rPr>
-          <w:spacing w:val="-1"/>
-        </w:rPr>
-        <w:t xml:space="preserve"> </w:t>
-      </w:r>
-      <w:r>
-        <w:t>датчика</w:t>
-      </w:r>
-      <w:r>
-        <w:rPr>
-          <w:spacing w:val="-6"/>
-        </w:rPr>
-        <w:t xml:space="preserve"> </w:t>
-      </w:r>
-      <w:r>
-        <w:t>обратной</w:t>
-      </w:r>
-      <w:r>
-        <w:rPr>
-          <w:spacing w:val="-7"/>
-        </w:rPr>
-        <w:t xml:space="preserve"> </w:t>
-      </w:r>
-      <w:r>
-        <w:rPr>
-          <w:spacing w:val="-2"/>
-        </w:rPr>
-        <w:t>связи</w:t>
+        <w:t>ВЫБОР ЧУВСТВИТЕЛЬНОГО ЭЛЕМЕНТА – ДАТЧИКА ОБРАТНОЙ СВЯЗИ</w:t>
       </w:r>
       <w:bookmarkEnd w:id="8"/>
     </w:p>
@@ -20586,7 +20584,7 @@
         <w:contextualSpacing/>
         <w:jc w:val="center"/>
       </w:pPr>
-      <w:bookmarkStart w:id="9" w:name="_Toc208186405"/>
+      <w:bookmarkStart w:id="9" w:name="_Toc213703618"/>
       <w:r>
         <w:lastRenderedPageBreak/>
         <w:t>ВЫБОР</w:t>
@@ -20619,12 +20617,11 @@
     </w:p>
     <w:p>
       <w:pPr>
-        <w:pStyle w:val="a3"/>
-        <w:spacing w:before="84" w:line="300" w:lineRule="auto"/>
+        <w:pStyle w:val="1"/>
+        <w:spacing w:line="300" w:lineRule="auto"/>
+        <w:ind w:left="709"/>
         <w:contextualSpacing/>
-        <w:rPr>
-          <w:b/>
-        </w:rPr>
+        <w:jc w:val="left"/>
       </w:pPr>
     </w:p>
     <w:p>
@@ -25357,7 +25354,7 @@
         <w:contextualSpacing/>
         <w:jc w:val="center"/>
       </w:pPr>
-      <w:bookmarkStart w:id="10" w:name="_Toc208186406"/>
+      <w:bookmarkStart w:id="10" w:name="_Toc213703619"/>
       <w:r>
         <w:lastRenderedPageBreak/>
         <w:t>ВЫБОР</w:t>
@@ -25983,13 +25980,23 @@
           <w:szCs w:val="28"/>
         </w:rPr>
       </w:pPr>
-      <w:r>
-        <w:rPr>
-          <w:rFonts w:eastAsiaTheme="minorHAnsi"/>
-          <w:sz w:val="28"/>
-          <w:szCs w:val="28"/>
-        </w:rPr>
-        <w:t xml:space="preserve">fоп = </w:t>
+      <w:proofErr w:type="spellStart"/>
+      <w:r>
+        <w:rPr>
+          <w:rFonts w:eastAsiaTheme="minorHAnsi"/>
+          <w:sz w:val="28"/>
+          <w:szCs w:val="28"/>
+        </w:rPr>
+        <w:t>fоп</w:t>
+      </w:r>
+      <w:proofErr w:type="spellEnd"/>
+      <w:r>
+        <w:rPr>
+          <w:rFonts w:eastAsiaTheme="minorHAnsi"/>
+          <w:sz w:val="28"/>
+          <w:szCs w:val="28"/>
+        </w:rPr>
+        <w:t xml:space="preserve"> = </w:t>
       </w:r>
       <m:oMath>
         <m:f>
@@ -26295,6 +26302,7 @@
           <w:szCs w:val="28"/>
         </w:rPr>
       </w:pPr>
+      <w:proofErr w:type="spellStart"/>
       <w:r>
         <w:rPr>
           <w:rFonts w:eastAsiaTheme="minorHAnsi"/>
@@ -26302,7 +26310,16 @@
           <w:szCs w:val="28"/>
         </w:rPr>
         <w:lastRenderedPageBreak/>
-        <w:t xml:space="preserve">Uопmax = </w:t>
+        <w:t>Uопmax</w:t>
+      </w:r>
+      <w:proofErr w:type="spellEnd"/>
+      <w:r>
+        <w:rPr>
+          <w:rFonts w:eastAsiaTheme="minorHAnsi"/>
+          <w:sz w:val="28"/>
+          <w:szCs w:val="28"/>
+        </w:rPr>
+        <w:t xml:space="preserve"> = </w:t>
       </w:r>
       <m:oMath>
         <m:f>
@@ -26447,13 +26464,23 @@
           <w:szCs w:val="28"/>
         </w:rPr>
       </w:pPr>
-      <w:r>
-        <w:rPr>
-          <w:rFonts w:eastAsiaTheme="minorHAnsi"/>
-          <w:sz w:val="28"/>
-          <w:szCs w:val="28"/>
-        </w:rPr>
-        <w:t xml:space="preserve">Uопmin = </w:t>
+      <w:proofErr w:type="spellStart"/>
+      <w:r>
+        <w:rPr>
+          <w:rFonts w:eastAsiaTheme="minorHAnsi"/>
+          <w:sz w:val="28"/>
+          <w:szCs w:val="28"/>
+        </w:rPr>
+        <w:t>Uопmin</w:t>
+      </w:r>
+      <w:proofErr w:type="spellEnd"/>
+      <w:r>
+        <w:rPr>
+          <w:rFonts w:eastAsiaTheme="minorHAnsi"/>
+          <w:sz w:val="28"/>
+          <w:szCs w:val="28"/>
+        </w:rPr>
+        <w:t xml:space="preserve"> = </w:t>
       </w:r>
       <m:oMath>
         <m:f>
@@ -27993,19 +28020,8 @@
                 <w:szCs w:val="28"/>
                 <w:lang w:val="ru-RU"/>
               </w:rPr>
-              <w:t xml:space="preserve">, </w:t>
-            </w:r>
-            <w:proofErr w:type="spellStart"/>
-            <w:r>
-              <w:rPr>
-                <w:rFonts w:eastAsiaTheme="minorHAnsi"/>
-                <w:sz w:val="28"/>
-                <w:szCs w:val="28"/>
-                <w:lang w:val="ru-RU"/>
-              </w:rPr>
-              <w:t>мА</w:t>
-            </w:r>
-            <w:proofErr w:type="spellEnd"/>
+              <w:t>, мА</w:t>
+            </w:r>
           </w:p>
         </w:tc>
         <w:tc>
@@ -28134,6 +28150,7 @@
                 <w:lang w:val="ru-RU"/>
               </w:rPr>
             </w:pPr>
+            <w:proofErr w:type="gramStart"/>
             <w:r>
               <w:rPr>
                 <w:rFonts w:eastAsiaTheme="minorHAnsi"/>
@@ -28141,7 +28158,17 @@
                 <w:szCs w:val="28"/>
                 <w:lang w:val="ru-RU"/>
               </w:rPr>
-              <w:t>&gt;=5</w:t>
+              <w:t>&gt;=</w:t>
+            </w:r>
+            <w:proofErr w:type="gramEnd"/>
+            <w:r>
+              <w:rPr>
+                <w:rFonts w:eastAsiaTheme="minorHAnsi"/>
+                <w:sz w:val="28"/>
+                <w:szCs w:val="28"/>
+                <w:lang w:val="ru-RU"/>
+              </w:rPr>
+              <w:t>5</w:t>
             </w:r>
           </w:p>
         </w:tc>
@@ -29754,6 +29781,7 @@
                 <w:lang w:val="ru-RU"/>
               </w:rPr>
             </w:pPr>
+            <w:proofErr w:type="spellStart"/>
             <w:r>
               <w:rPr>
                 <w:rFonts w:eastAsiaTheme="minorHAnsi"/>
@@ -29761,7 +29789,17 @@
                 <w:szCs w:val="28"/>
                 <w:lang w:val="ru-RU"/>
               </w:rPr>
-              <w:t>U</w:t>
+              <w:t>Uкэ</w:t>
+            </w:r>
+            <w:proofErr w:type="spellEnd"/>
+            <w:r>
+              <w:rPr>
+                <w:rFonts w:eastAsiaTheme="minorHAnsi"/>
+                <w:sz w:val="28"/>
+                <w:szCs w:val="28"/>
+                <w:lang w:val="ru-RU"/>
+              </w:rPr>
+              <w:t xml:space="preserve"> </w:t>
             </w:r>
             <w:proofErr w:type="spellStart"/>
             <w:r>
@@ -29771,7 +29809,7 @@
                 <w:szCs w:val="28"/>
                 <w:lang w:val="ru-RU"/>
               </w:rPr>
-              <w:t>кэ</w:t>
+              <w:t>max</w:t>
             </w:r>
             <w:proofErr w:type="spellEnd"/>
             <w:r>
@@ -29781,7 +29819,7 @@
                 <w:szCs w:val="28"/>
                 <w:lang w:val="ru-RU"/>
               </w:rPr>
-              <w:t xml:space="preserve"> max, В</w:t>
+              <w:t>, В</w:t>
             </w:r>
           </w:p>
         </w:tc>
@@ -29804,6 +29842,7 @@
                 <w:lang w:val="ru-RU"/>
               </w:rPr>
             </w:pPr>
+            <w:proofErr w:type="spellStart"/>
             <w:r>
               <w:rPr>
                 <w:rFonts w:eastAsiaTheme="minorHAnsi"/>
@@ -29811,7 +29850,17 @@
                 <w:szCs w:val="28"/>
                 <w:lang w:val="ru-RU"/>
               </w:rPr>
-              <w:t>U</w:t>
+              <w:t>Uбэ</w:t>
+            </w:r>
+            <w:proofErr w:type="spellEnd"/>
+            <w:r>
+              <w:rPr>
+                <w:rFonts w:eastAsiaTheme="minorHAnsi"/>
+                <w:sz w:val="28"/>
+                <w:szCs w:val="28"/>
+                <w:lang w:val="ru-RU"/>
+              </w:rPr>
+              <w:t xml:space="preserve"> </w:t>
             </w:r>
             <w:proofErr w:type="spellStart"/>
             <w:r>
@@ -29821,7 +29870,7 @@
                 <w:szCs w:val="28"/>
                 <w:lang w:val="ru-RU"/>
               </w:rPr>
-              <w:t>бэ</w:t>
+              <w:t>max</w:t>
             </w:r>
             <w:proofErr w:type="spellEnd"/>
             <w:r>
@@ -29831,7 +29880,7 @@
                 <w:szCs w:val="28"/>
                 <w:lang w:val="ru-RU"/>
               </w:rPr>
-              <w:t xml:space="preserve"> max, В</w:t>
+              <w:t>, В</w:t>
             </w:r>
           </w:p>
         </w:tc>
@@ -29854,6 +29903,7 @@
                 <w:lang w:val="ru-RU"/>
               </w:rPr>
             </w:pPr>
+            <w:proofErr w:type="spellStart"/>
             <w:r>
               <w:rPr>
                 <w:rFonts w:eastAsiaTheme="minorHAnsi"/>
@@ -29861,8 +29911,49 @@
                 <w:szCs w:val="28"/>
                 <w:lang w:val="ru-RU"/>
               </w:rPr>
-              <w:t>Iк max, А</w:t>
-            </w:r>
+              <w:t>Iк</w:t>
+            </w:r>
+            <w:proofErr w:type="spellEnd"/>
+            <w:r>
+              <w:rPr>
+                <w:rFonts w:eastAsiaTheme="minorHAnsi"/>
+                <w:sz w:val="28"/>
+                <w:szCs w:val="28"/>
+                <w:lang w:val="ru-RU"/>
+              </w:rPr>
+              <w:t xml:space="preserve"> </w:t>
+            </w:r>
+            <w:proofErr w:type="spellStart"/>
+            <w:r>
+              <w:rPr>
+                <w:rFonts w:eastAsiaTheme="minorHAnsi"/>
+                <w:sz w:val="28"/>
+                <w:szCs w:val="28"/>
+                <w:lang w:val="ru-RU"/>
+              </w:rPr>
+              <w:t>max</w:t>
+            </w:r>
+            <w:proofErr w:type="spellEnd"/>
+            <w:r>
+              <w:rPr>
+                <w:rFonts w:eastAsiaTheme="minorHAnsi"/>
+                <w:sz w:val="28"/>
+                <w:szCs w:val="28"/>
+                <w:lang w:val="ru-RU"/>
+              </w:rPr>
+              <w:t xml:space="preserve">, </w:t>
+            </w:r>
+            <w:proofErr w:type="gramStart"/>
+            <w:r>
+              <w:rPr>
+                <w:rFonts w:eastAsiaTheme="minorHAnsi"/>
+                <w:sz w:val="28"/>
+                <w:szCs w:val="28"/>
+                <w:lang w:val="ru-RU"/>
+              </w:rPr>
+              <w:t>А</w:t>
+            </w:r>
+            <w:proofErr w:type="gramEnd"/>
           </w:p>
         </w:tc>
         <w:tc>
@@ -29902,7 +29993,7 @@
                 <w:szCs w:val="28"/>
                 <w:lang w:val="ru-RU"/>
               </w:rPr>
-              <w:t xml:space="preserve"> max, </w:t>
+              <w:t xml:space="preserve"> </w:t>
             </w:r>
             <w:proofErr w:type="spellStart"/>
             <w:r>
@@ -29912,9 +30003,18 @@
                 <w:szCs w:val="28"/>
                 <w:lang w:val="ru-RU"/>
               </w:rPr>
-              <w:t>Вт</w:t>
+              <w:t>max</w:t>
             </w:r>
             <w:proofErr w:type="spellEnd"/>
+            <w:r>
+              <w:rPr>
+                <w:rFonts w:eastAsiaTheme="minorHAnsi"/>
+                <w:sz w:val="28"/>
+                <w:szCs w:val="28"/>
+                <w:lang w:val="ru-RU"/>
+              </w:rPr>
+              <w:t>, Вт</w:t>
+            </w:r>
           </w:p>
         </w:tc>
         <w:tc>
@@ -30271,6 +30371,7 @@
           <w:rFonts w:eastAsiaTheme="minorHAnsi"/>
           <w:sz w:val="28"/>
           <w:szCs w:val="28"/>
+          <w:lang w:val="en-US"/>
         </w:rPr>
       </w:pPr>
       <m:oMath>
@@ -30293,6 +30394,7 @@
                 <w:rFonts w:ascii="Cambria Math" w:eastAsiaTheme="minorHAnsi" w:hAnsi="Cambria Math"/>
                 <w:sz w:val="28"/>
                 <w:szCs w:val="28"/>
+                <w:lang w:val="en-US"/>
               </w:rPr>
               <m:t>I</m:t>
             </m:r>
@@ -30319,6 +30421,7 @@
                 <w:rFonts w:ascii="Cambria Math" w:eastAsiaTheme="minorHAnsi" w:hAnsi="Cambria Math"/>
                 <w:sz w:val="28"/>
                 <w:szCs w:val="28"/>
+                <w:lang w:val="en-US"/>
               </w:rPr>
               <m:t>VT4</m:t>
             </m:r>
@@ -30332,6 +30435,7 @@
             <w:rFonts w:ascii="Cambria Math" w:eastAsiaTheme="minorHAnsi" w:hAnsi="Cambria Math"/>
             <w:sz w:val="28"/>
             <w:szCs w:val="28"/>
+            <w:lang w:val="en-US"/>
           </w:rPr>
           <m:t>=S</m:t>
         </m:r>
@@ -30365,6 +30469,7 @@
                     <w:rFonts w:ascii="Cambria Math" w:eastAsiaTheme="minorHAnsi" w:hAnsi="Cambria Math"/>
                     <w:sz w:val="28"/>
                     <w:szCs w:val="28"/>
+                    <w:lang w:val="en-US"/>
                   </w:rPr>
                   <m:t>I</m:t>
                 </m:r>
@@ -30404,6 +30509,7 @@
                     <w:rFonts w:ascii="Cambria Math" w:eastAsiaTheme="minorHAnsi" w:hAnsi="Cambria Math"/>
                     <w:sz w:val="28"/>
                     <w:szCs w:val="28"/>
+                    <w:lang w:val="en-US"/>
                   </w:rPr>
                   <m:t>h</m:t>
                 </m:r>
@@ -30417,8 +30523,20 @@
                     <w:rFonts w:ascii="Cambria Math" w:eastAsiaTheme="minorHAnsi" w:hAnsi="Cambria Math"/>
                     <w:sz w:val="28"/>
                     <w:szCs w:val="28"/>
+                    <w:lang w:val="en-US"/>
                   </w:rPr>
-                  <m:t>21э</m:t>
+                  <m:t>21</m:t>
+                </m:r>
+                <m:r>
+                  <m:rPr>
+                    <m:sty m:val="p"/>
+                  </m:rPr>
+                  <w:rPr>
+                    <w:rFonts w:ascii="Cambria Math" w:eastAsiaTheme="minorHAnsi" w:hAnsi="Cambria Math"/>
+                    <w:sz w:val="28"/>
+                    <w:szCs w:val="28"/>
+                  </w:rPr>
+                  <m:t>э</m:t>
                 </m:r>
               </m:sub>
             </m:sSub>
@@ -30430,6 +30548,7 @@
           <w:rFonts w:eastAsiaTheme="minorHAnsi"/>
           <w:sz w:val="28"/>
           <w:szCs w:val="28"/>
+          <w:lang w:val="en-US"/>
         </w:rPr>
         <w:t>, S = 1.5…3;</w:t>
       </w:r>
@@ -31405,7 +31524,6 @@
                 <w:lang w:val="ru-RU"/>
               </w:rPr>
             </w:pPr>
-            <w:proofErr w:type="spellStart"/>
             <w:r>
               <w:rPr>
                 <w:rFonts w:eastAsiaTheme="minorHAnsi"/>
@@ -31415,7 +31533,6 @@
               </w:rPr>
               <w:t>Тип</w:t>
             </w:r>
-            <w:proofErr w:type="spellEnd"/>
           </w:p>
         </w:tc>
         <w:tc>
@@ -31505,6 +31622,7 @@
                 <w:lang w:val="ru-RU"/>
               </w:rPr>
             </w:pPr>
+            <w:proofErr w:type="spellStart"/>
             <w:r>
               <w:rPr>
                 <w:rFonts w:eastAsiaTheme="minorHAnsi"/>
@@ -31512,7 +31630,17 @@
                 <w:szCs w:val="28"/>
                 <w:lang w:val="ru-RU"/>
               </w:rPr>
-              <w:t>U</w:t>
+              <w:t>Uкб</w:t>
+            </w:r>
+            <w:proofErr w:type="spellEnd"/>
+            <w:r>
+              <w:rPr>
+                <w:rFonts w:eastAsiaTheme="minorHAnsi"/>
+                <w:sz w:val="28"/>
+                <w:szCs w:val="28"/>
+                <w:lang w:val="ru-RU"/>
+              </w:rPr>
+              <w:t xml:space="preserve"> </w:t>
             </w:r>
             <w:proofErr w:type="spellStart"/>
             <w:r>
@@ -31522,7 +31650,7 @@
                 <w:szCs w:val="28"/>
                 <w:lang w:val="ru-RU"/>
               </w:rPr>
-              <w:t>кб</w:t>
+              <w:t>max</w:t>
             </w:r>
             <w:proofErr w:type="spellEnd"/>
             <w:r>
@@ -31532,7 +31660,7 @@
                 <w:szCs w:val="28"/>
                 <w:lang w:val="ru-RU"/>
               </w:rPr>
-              <w:t xml:space="preserve"> max, В</w:t>
+              <w:t>, В</w:t>
             </w:r>
           </w:p>
         </w:tc>
@@ -31623,6 +31751,7 @@
                 <w:lang w:val="ru-RU"/>
               </w:rPr>
             </w:pPr>
+            <w:proofErr w:type="spellStart"/>
             <w:r>
               <w:rPr>
                 <w:rFonts w:eastAsiaTheme="minorHAnsi"/>
@@ -31630,7 +31759,17 @@
                 <w:szCs w:val="28"/>
                 <w:lang w:val="ru-RU"/>
               </w:rPr>
-              <w:t>U</w:t>
+              <w:t>Uкэ</w:t>
+            </w:r>
+            <w:proofErr w:type="spellEnd"/>
+            <w:r>
+              <w:rPr>
+                <w:rFonts w:eastAsiaTheme="minorHAnsi"/>
+                <w:sz w:val="28"/>
+                <w:szCs w:val="28"/>
+                <w:lang w:val="ru-RU"/>
+              </w:rPr>
+              <w:t xml:space="preserve"> </w:t>
             </w:r>
             <w:proofErr w:type="spellStart"/>
             <w:r>
@@ -31640,7 +31779,7 @@
                 <w:szCs w:val="28"/>
                 <w:lang w:val="ru-RU"/>
               </w:rPr>
-              <w:t>кэ</w:t>
+              <w:t>max</w:t>
             </w:r>
             <w:proofErr w:type="spellEnd"/>
             <w:r>
@@ -31650,7 +31789,7 @@
                 <w:szCs w:val="28"/>
                 <w:lang w:val="ru-RU"/>
               </w:rPr>
-              <w:t xml:space="preserve"> max, В</w:t>
+              <w:t>, В</w:t>
             </w:r>
           </w:p>
         </w:tc>
@@ -31741,6 +31880,7 @@
                 <w:lang w:val="ru-RU"/>
               </w:rPr>
             </w:pPr>
+            <w:proofErr w:type="spellStart"/>
             <w:r>
               <w:rPr>
                 <w:rFonts w:eastAsiaTheme="minorHAnsi"/>
@@ -31748,8 +31888,49 @@
                 <w:szCs w:val="28"/>
                 <w:lang w:val="ru-RU"/>
               </w:rPr>
-              <w:t>Iк max, А</w:t>
-            </w:r>
+              <w:t>Iк</w:t>
+            </w:r>
+            <w:proofErr w:type="spellEnd"/>
+            <w:r>
+              <w:rPr>
+                <w:rFonts w:eastAsiaTheme="minorHAnsi"/>
+                <w:sz w:val="28"/>
+                <w:szCs w:val="28"/>
+                <w:lang w:val="ru-RU"/>
+              </w:rPr>
+              <w:t xml:space="preserve"> </w:t>
+            </w:r>
+            <w:proofErr w:type="spellStart"/>
+            <w:r>
+              <w:rPr>
+                <w:rFonts w:eastAsiaTheme="minorHAnsi"/>
+                <w:sz w:val="28"/>
+                <w:szCs w:val="28"/>
+                <w:lang w:val="ru-RU"/>
+              </w:rPr>
+              <w:t>max</w:t>
+            </w:r>
+            <w:proofErr w:type="spellEnd"/>
+            <w:r>
+              <w:rPr>
+                <w:rFonts w:eastAsiaTheme="minorHAnsi"/>
+                <w:sz w:val="28"/>
+                <w:szCs w:val="28"/>
+                <w:lang w:val="ru-RU"/>
+              </w:rPr>
+              <w:t xml:space="preserve">, </w:t>
+            </w:r>
+            <w:proofErr w:type="gramStart"/>
+            <w:r>
+              <w:rPr>
+                <w:rFonts w:eastAsiaTheme="minorHAnsi"/>
+                <w:sz w:val="28"/>
+                <w:szCs w:val="28"/>
+                <w:lang w:val="ru-RU"/>
+              </w:rPr>
+              <w:t>А</w:t>
+            </w:r>
+            <w:proofErr w:type="gramEnd"/>
           </w:p>
         </w:tc>
         <w:tc>
@@ -31857,7 +32038,7 @@
                 <w:szCs w:val="28"/>
                 <w:lang w:val="ru-RU"/>
               </w:rPr>
-              <w:t xml:space="preserve"> max, </w:t>
+              <w:t xml:space="preserve"> </w:t>
             </w:r>
             <w:proofErr w:type="spellStart"/>
             <w:r>
@@ -31867,9 +32048,18 @@
                 <w:szCs w:val="28"/>
                 <w:lang w:val="ru-RU"/>
               </w:rPr>
-              <w:t>Вт</w:t>
+              <w:t>max</w:t>
             </w:r>
             <w:proofErr w:type="spellEnd"/>
+            <w:r>
+              <w:rPr>
+                <w:rFonts w:eastAsiaTheme="minorHAnsi"/>
+                <w:sz w:val="28"/>
+                <w:szCs w:val="28"/>
+                <w:lang w:val="ru-RU"/>
+              </w:rPr>
+              <w:t>, Вт</w:t>
+            </w:r>
           </w:p>
         </w:tc>
         <w:tc>
@@ -32111,13 +32301,15 @@
           <w:rFonts w:eastAsiaTheme="minorHAnsi"/>
           <w:sz w:val="28"/>
           <w:szCs w:val="28"/>
-        </w:rPr>
-      </w:pPr>
-      <w:r>
-        <w:rPr>
-          <w:rFonts w:eastAsiaTheme="minorHAnsi"/>
-          <w:sz w:val="28"/>
-          <w:szCs w:val="28"/>
+          <w:lang w:val="en-US"/>
+        </w:rPr>
+      </w:pPr>
+      <w:r>
+        <w:rPr>
+          <w:rFonts w:eastAsiaTheme="minorHAnsi"/>
+          <w:sz w:val="28"/>
+          <w:szCs w:val="28"/>
+          <w:lang w:val="en-US"/>
         </w:rPr>
         <w:t xml:space="preserve">R22 = </w:t>
       </w:r>
@@ -32152,6 +32344,7 @@
                     <w:rFonts w:ascii="Cambria Math" w:eastAsiaTheme="minorHAnsi" w:hAnsi="Cambria Math"/>
                     <w:sz w:val="28"/>
                     <w:szCs w:val="28"/>
+                    <w:lang w:val="en-US"/>
                   </w:rPr>
                   <m:t>U</m:t>
                 </m:r>
@@ -32191,6 +32384,7 @@
                     <w:rFonts w:ascii="Cambria Math" w:eastAsiaTheme="minorHAnsi" w:hAnsi="Cambria Math"/>
                     <w:sz w:val="28"/>
                     <w:szCs w:val="28"/>
+                    <w:lang w:val="en-US"/>
                   </w:rPr>
                   <m:t>I</m:t>
                 </m:r>
@@ -32217,6 +32411,7 @@
                     <w:rFonts w:ascii="Cambria Math" w:eastAsiaTheme="minorHAnsi" w:hAnsi="Cambria Math"/>
                     <w:sz w:val="28"/>
                     <w:szCs w:val="28"/>
+                    <w:lang w:val="en-US"/>
                   </w:rPr>
                   <m:t>VT2</m:t>
                 </m:r>
@@ -32230,6 +32425,7 @@
           <w:rFonts w:eastAsiaTheme="minorHAnsi"/>
           <w:sz w:val="28"/>
           <w:szCs w:val="28"/>
+          <w:lang w:val="en-US"/>
         </w:rPr>
         <w:t xml:space="preserve"> = </w:t>
       </w:r>
@@ -32253,6 +32449,7 @@
                 <w:rFonts w:ascii="Cambria Math" w:eastAsiaTheme="minorHAnsi" w:hAnsi="Cambria Math"/>
                 <w:sz w:val="28"/>
                 <w:szCs w:val="28"/>
+                <w:lang w:val="en-US"/>
               </w:rPr>
               <m:t>10</m:t>
             </m:r>
@@ -32266,6 +32463,7 @@
                 <w:rFonts w:ascii="Cambria Math" w:eastAsiaTheme="minorHAnsi" w:hAnsi="Cambria Math"/>
                 <w:sz w:val="28"/>
                 <w:szCs w:val="28"/>
+                <w:lang w:val="en-US"/>
               </w:rPr>
               <m:t>0,005</m:t>
             </m:r>
@@ -32279,8 +32477,20 @@
             <w:rFonts w:ascii="Cambria Math" w:eastAsiaTheme="minorHAnsi" w:hAnsi="Cambria Math"/>
             <w:sz w:val="28"/>
             <w:szCs w:val="28"/>
+            <w:lang w:val="en-US"/>
           </w:rPr>
-          <m:t>=2 кОм</m:t>
+          <m:t xml:space="preserve">=2 </m:t>
+        </m:r>
+        <m:r>
+          <m:rPr>
+            <m:sty m:val="p"/>
+          </m:rPr>
+          <w:rPr>
+            <w:rFonts w:ascii="Cambria Math" w:eastAsiaTheme="minorHAnsi" w:hAnsi="Cambria Math"/>
+            <w:sz w:val="28"/>
+            <w:szCs w:val="28"/>
+          </w:rPr>
+          <m:t>кОм</m:t>
         </m:r>
       </m:oMath>
     </w:p>
@@ -32329,7 +32539,7 @@
           <w:sz w:val="28"/>
           <w:szCs w:val="28"/>
         </w:rPr>
-        <w:t>E – 2 U</w:t>
+        <w:t xml:space="preserve">E – 2 </w:t>
       </w:r>
       <w:proofErr w:type="spellStart"/>
       <w:r>
@@ -32338,7 +32548,7 @@
           <w:sz w:val="28"/>
           <w:szCs w:val="28"/>
         </w:rPr>
-        <w:t>кэ</w:t>
+        <w:t>Uкэ</w:t>
       </w:r>
       <w:proofErr w:type="spellEnd"/>
       <w:r>
@@ -32423,13 +32633,23 @@
           <w:szCs w:val="28"/>
         </w:rPr>
       </w:pPr>
-      <w:r>
-        <w:rPr>
-          <w:rFonts w:eastAsiaTheme="minorHAnsi"/>
-          <w:sz w:val="28"/>
-          <w:szCs w:val="28"/>
-        </w:rPr>
-        <w:t xml:space="preserve">Kшип = </w:t>
+      <w:proofErr w:type="spellStart"/>
+      <w:r>
+        <w:rPr>
+          <w:rFonts w:eastAsiaTheme="minorHAnsi"/>
+          <w:sz w:val="28"/>
+          <w:szCs w:val="28"/>
+        </w:rPr>
+        <w:t>Kшип</w:t>
+      </w:r>
+      <w:proofErr w:type="spellEnd"/>
+      <w:r>
+        <w:rPr>
+          <w:rFonts w:eastAsiaTheme="minorHAnsi"/>
+          <w:sz w:val="28"/>
+          <w:szCs w:val="28"/>
+        </w:rPr>
+        <w:t xml:space="preserve"> = </w:t>
       </w:r>
       <m:oMath>
         <m:f>
@@ -32729,7 +32949,7 @@
         <w:contextualSpacing/>
         <w:jc w:val="left"/>
       </w:pPr>
-      <w:bookmarkStart w:id="11" w:name="_Toc208186407"/>
+      <w:bookmarkStart w:id="11" w:name="_Toc213703620"/>
       <w:r>
         <w:lastRenderedPageBreak/>
         <w:t>СТРУКТУРНАЯ</w:t>
@@ -33007,13 +33227,15 @@
           <w:rFonts w:eastAsiaTheme="minorEastAsia"/>
           <w:sz w:val="28"/>
           <w:szCs w:val="28"/>
-        </w:rPr>
-      </w:pPr>
-      <w:r>
-        <w:rPr>
-          <w:rFonts w:eastAsiaTheme="minorHAnsi"/>
-          <w:sz w:val="28"/>
-          <w:szCs w:val="28"/>
+          <w:lang w:val="en-US"/>
+        </w:rPr>
+      </w:pPr>
+      <w:r>
+        <w:rPr>
+          <w:rFonts w:eastAsiaTheme="minorHAnsi"/>
+          <w:sz w:val="28"/>
+          <w:szCs w:val="28"/>
+          <w:lang w:val="en-US"/>
         </w:rPr>
         <w:t xml:space="preserve">W(p) = </w:t>
       </w:r>
@@ -33055,6 +33277,7 @@
                 <w:rFonts w:ascii="Cambria Math" w:eastAsiaTheme="minorHAnsi" w:hAnsi="Cambria Math"/>
                 <w:sz w:val="28"/>
                 <w:szCs w:val="28"/>
+                <w:lang w:val="en-US"/>
               </w:rPr>
               <m:t>(1+</m:t>
             </m:r>
@@ -33108,6 +33331,7 @@
                 <w:rFonts w:ascii="Cambria Math" w:eastAsiaTheme="minorHAnsi" w:hAnsi="Cambria Math"/>
                 <w:sz w:val="28"/>
                 <w:szCs w:val="28"/>
+                <w:lang w:val="en-US"/>
               </w:rPr>
               <m:t>)(1+</m:t>
             </m:r>
@@ -33161,6 +33385,7 @@
                 <w:rFonts w:ascii="Cambria Math" w:eastAsiaTheme="minorHAnsi" w:hAnsi="Cambria Math"/>
                 <w:sz w:val="28"/>
                 <w:szCs w:val="28"/>
+                <w:lang w:val="en-US"/>
               </w:rPr>
               <m:t>)</m:t>
             </m:r>
@@ -33181,6 +33406,7 @@
           <w:rFonts w:eastAsiaTheme="minorHAnsi"/>
           <w:sz w:val="28"/>
           <w:szCs w:val="28"/>
+          <w:lang w:val="en-US"/>
         </w:rPr>
       </w:pPr>
     </w:p>
@@ -33334,43 +33560,7 @@
           <w:sz w:val="28"/>
           <w:szCs w:val="28"/>
         </w:rPr>
-        <w:t xml:space="preserve">, K = </w:t>
-      </w:r>
-      <w:proofErr w:type="spellStart"/>
-      <w:r>
-        <w:rPr>
-          <w:rFonts w:eastAsiaTheme="minorHAnsi"/>
-          <w:sz w:val="28"/>
-          <w:szCs w:val="28"/>
-        </w:rPr>
-        <w:t>Dw</w:t>
-      </w:r>
-      <w:proofErr w:type="spellEnd"/>
-      <w:r>
-        <w:rPr>
-          <w:rFonts w:eastAsiaTheme="minorHAnsi"/>
-          <w:sz w:val="28"/>
-          <w:szCs w:val="28"/>
-        </w:rPr>
-        <w:t xml:space="preserve"> = K</w:t>
-      </w:r>
-      <w:proofErr w:type="spellStart"/>
-      <w:r>
-        <w:rPr>
-          <w:rFonts w:eastAsiaTheme="minorHAnsi"/>
-          <w:sz w:val="28"/>
-          <w:szCs w:val="28"/>
-        </w:rPr>
-        <w:t>чэ</w:t>
-      </w:r>
-      <w:proofErr w:type="spellEnd"/>
-      <w:r>
-        <w:rPr>
-          <w:rFonts w:eastAsiaTheme="minorHAnsi"/>
-          <w:sz w:val="28"/>
-          <w:szCs w:val="28"/>
-        </w:rPr>
-        <w:t>*</w:t>
+        <w:t>, K = Dw = Kчэ*</w:t>
       </w:r>
       <m:oMath>
         <m:sSub>
@@ -33419,14 +33609,6 @@
         </w:rPr>
         <w:t>*</w:t>
       </w:r>
-      <w:r>
-        <w:rPr>
-          <w:rFonts w:eastAsiaTheme="minorHAnsi"/>
-          <w:sz w:val="28"/>
-          <w:szCs w:val="28"/>
-        </w:rPr>
-        <w:t>Kу*Kшип*Kд*K</w:t>
-      </w:r>
       <w:proofErr w:type="spellStart"/>
       <w:r>
         <w:rPr>
@@ -33434,7 +33616,61 @@
           <w:sz w:val="28"/>
           <w:szCs w:val="28"/>
         </w:rPr>
-        <w:t>ред</w:t>
+        <w:t>Kу</w:t>
+      </w:r>
+      <w:proofErr w:type="spellEnd"/>
+      <w:r>
+        <w:rPr>
+          <w:rFonts w:eastAsiaTheme="minorHAnsi"/>
+          <w:sz w:val="28"/>
+          <w:szCs w:val="28"/>
+        </w:rPr>
+        <w:t>*</w:t>
+      </w:r>
+      <w:proofErr w:type="spellStart"/>
+      <w:r>
+        <w:rPr>
+          <w:rFonts w:eastAsiaTheme="minorHAnsi"/>
+          <w:sz w:val="28"/>
+          <w:szCs w:val="28"/>
+        </w:rPr>
+        <w:t>Kшип</w:t>
+      </w:r>
+      <w:proofErr w:type="spellEnd"/>
+      <w:r>
+        <w:rPr>
+          <w:rFonts w:eastAsiaTheme="minorHAnsi"/>
+          <w:sz w:val="28"/>
+          <w:szCs w:val="28"/>
+        </w:rPr>
+        <w:t>*</w:t>
+      </w:r>
+      <w:proofErr w:type="spellStart"/>
+      <w:r>
+        <w:rPr>
+          <w:rFonts w:eastAsiaTheme="minorHAnsi"/>
+          <w:sz w:val="28"/>
+          <w:szCs w:val="28"/>
+        </w:rPr>
+        <w:t>Kд</w:t>
+      </w:r>
+      <w:proofErr w:type="spellEnd"/>
+      <w:r>
+        <w:rPr>
+          <w:rFonts w:eastAsiaTheme="minorHAnsi"/>
+          <w:sz w:val="28"/>
+          <w:szCs w:val="28"/>
+        </w:rPr>
+        <w:t>*</w:t>
+      </w:r>
+      <w:proofErr w:type="spellStart"/>
+      <w:r>
+        <w:rPr>
+          <w:rFonts w:eastAsiaTheme="minorHAnsi"/>
+          <w:sz w:val="28"/>
+          <w:szCs w:val="28"/>
+        </w:rPr>
+        <w:t>Kред</w:t>
       </w:r>
       <w:proofErr w:type="spellEnd"/>
     </w:p>
@@ -33453,14 +33689,6 @@
           <w:szCs w:val="28"/>
         </w:rPr>
       </w:pPr>
-      <w:r>
-        <w:rPr>
-          <w:rFonts w:eastAsiaTheme="minorHAnsi"/>
-          <w:sz w:val="28"/>
-          <w:szCs w:val="28"/>
-        </w:rPr>
-        <w:t>K</w:t>
-      </w:r>
       <w:proofErr w:type="spellStart"/>
       <w:r>
         <w:rPr>
@@ -33468,7 +33696,7 @@
           <w:sz w:val="28"/>
           <w:szCs w:val="28"/>
         </w:rPr>
-        <w:t>чэ</w:t>
+        <w:t>Kчэ</w:t>
       </w:r>
       <w:proofErr w:type="spellEnd"/>
       <w:r>
@@ -33503,6 +33731,7 @@
           <w:szCs w:val="28"/>
         </w:rPr>
       </w:pPr>
+      <w:proofErr w:type="spellStart"/>
       <w:r>
         <w:rPr>
           <w:rFonts w:eastAsiaTheme="minorHAnsi"/>
@@ -33511,6 +33740,7 @@
         </w:rPr>
         <w:t>Kшип</w:t>
       </w:r>
+      <w:proofErr w:type="spellEnd"/>
       <w:r>
         <w:rPr>
           <w:rFonts w:eastAsiaTheme="minorHAnsi"/>
@@ -33543,13 +33773,23 @@
           <w:szCs w:val="28"/>
         </w:rPr>
       </w:pPr>
-      <w:r>
-        <w:rPr>
-          <w:rFonts w:eastAsiaTheme="minorHAnsi"/>
-          <w:sz w:val="28"/>
-          <w:szCs w:val="28"/>
-        </w:rPr>
-        <w:t xml:space="preserve">Kд = </w:t>
+      <w:proofErr w:type="spellStart"/>
+      <w:r>
+        <w:rPr>
+          <w:rFonts w:eastAsiaTheme="minorHAnsi"/>
+          <w:sz w:val="28"/>
+          <w:szCs w:val="28"/>
+        </w:rPr>
+        <w:t>Kд</w:t>
+      </w:r>
+      <w:proofErr w:type="spellEnd"/>
+      <w:r>
+        <w:rPr>
+          <w:rFonts w:eastAsiaTheme="minorHAnsi"/>
+          <w:sz w:val="28"/>
+          <w:szCs w:val="28"/>
+        </w:rPr>
+        <w:t xml:space="preserve"> = </w:t>
       </w:r>
       <m:oMath>
         <m:r>
@@ -33580,14 +33820,6 @@
           <w:szCs w:val="28"/>
         </w:rPr>
       </w:pPr>
-      <w:r>
-        <w:rPr>
-          <w:rFonts w:eastAsiaTheme="minorHAnsi"/>
-          <w:sz w:val="28"/>
-          <w:szCs w:val="28"/>
-        </w:rPr>
-        <w:t>K</w:t>
-      </w:r>
       <w:proofErr w:type="spellStart"/>
       <w:r>
         <w:rPr>
@@ -33595,7 +33827,7 @@
           <w:sz w:val="28"/>
           <w:szCs w:val="28"/>
         </w:rPr>
-        <w:t>ред</w:t>
+        <w:t>Kред</w:t>
       </w:r>
       <w:proofErr w:type="spellEnd"/>
       <w:r>
@@ -33634,18 +33866,7 @@
             <w:sz w:val="28"/>
             <w:szCs w:val="28"/>
           </w:rPr>
-          <m:t>4</m:t>
-        </m:r>
-        <m:r>
-          <m:rPr>
-            <m:sty m:val="p"/>
-          </m:rPr>
-          <w:rPr>
-            <w:rFonts w:ascii="Cambria Math" w:eastAsia="Cambria Math" w:hAnsi="Cambria Math"/>
-            <w:sz w:val="28"/>
-            <w:szCs w:val="28"/>
-          </w:rPr>
-          <m:t>68.12</m:t>
+          <m:t>468.12</m:t>
         </m:r>
       </m:oMath>
       <w:r>
@@ -33739,18 +33960,7 @@
               <w:sz w:val="28"/>
               <w:szCs w:val="28"/>
             </w:rPr>
-            <m:t>=0.47</m:t>
-          </m:r>
-          <m:r>
-            <m:rPr>
-              <m:sty m:val="p"/>
-            </m:rPr>
-            <w:rPr>
-              <w:rFonts w:ascii="Cambria Math" w:eastAsiaTheme="minorHAnsi" w:hAnsi="Cambria Math"/>
-              <w:sz w:val="28"/>
-              <w:szCs w:val="28"/>
-            </w:rPr>
-            <m:t>7</m:t>
+            <m:t>=0.477</m:t>
           </m:r>
         </m:oMath>
       </m:oMathPara>
@@ -33768,13 +33978,15 @@
           <w:rFonts w:eastAsiaTheme="minorHAnsi"/>
           <w:sz w:val="28"/>
           <w:szCs w:val="28"/>
-        </w:rPr>
-      </w:pPr>
-      <w:r>
-        <w:rPr>
-          <w:rFonts w:eastAsiaTheme="minorHAnsi"/>
-          <w:sz w:val="28"/>
-          <w:szCs w:val="28"/>
+          <w:lang w:val="en-US"/>
+        </w:rPr>
+      </w:pPr>
+      <w:r>
+        <w:rPr>
+          <w:rFonts w:eastAsiaTheme="minorHAnsi"/>
+          <w:sz w:val="28"/>
+          <w:szCs w:val="28"/>
+          <w:lang w:val="en-US"/>
         </w:rPr>
         <w:t>K</w:t>
       </w:r>
@@ -33783,6 +33995,7 @@
           <w:rFonts w:eastAsiaTheme="minorHAnsi"/>
           <w:sz w:val="28"/>
           <w:szCs w:val="28"/>
+          <w:lang w:val="en-US"/>
         </w:rPr>
         <w:t xml:space="preserve"> = </w:t>
       </w:r>
@@ -33791,6 +34004,7 @@
           <w:rFonts w:eastAsiaTheme="minorHAnsi"/>
           <w:sz w:val="28"/>
           <w:szCs w:val="28"/>
+          <w:lang w:val="en-US"/>
         </w:rPr>
         <w:t>54.02*39.5</w:t>
       </w:r>
@@ -33799,6 +34013,7 @@
           <w:rFonts w:eastAsiaTheme="minorHAnsi"/>
           <w:sz w:val="28"/>
           <w:szCs w:val="28"/>
+          <w:lang w:val="en-US"/>
         </w:rPr>
         <w:t>*2.</w:t>
       </w:r>
@@ -33807,6 +34022,7 @@
           <w:rFonts w:eastAsiaTheme="minorHAnsi"/>
           <w:sz w:val="28"/>
           <w:szCs w:val="28"/>
+          <w:lang w:val="en-US"/>
         </w:rPr>
         <w:t>4096</w:t>
       </w:r>
@@ -33815,6 +34031,7 @@
           <w:rFonts w:eastAsiaTheme="minorHAnsi"/>
           <w:sz w:val="28"/>
           <w:szCs w:val="28"/>
+          <w:lang w:val="en-US"/>
         </w:rPr>
         <w:t>*0,002</w:t>
       </w:r>
@@ -33823,6 +34040,7 @@
           <w:rFonts w:eastAsiaTheme="minorHAnsi"/>
           <w:sz w:val="28"/>
           <w:szCs w:val="28"/>
+          <w:lang w:val="en-US"/>
         </w:rPr>
         <w:t>*Ky</w:t>
       </w:r>
@@ -33831,6 +34049,7 @@
           <w:rFonts w:eastAsiaTheme="minorHAnsi"/>
           <w:sz w:val="28"/>
           <w:szCs w:val="28"/>
+          <w:lang w:val="en-US"/>
         </w:rPr>
         <w:t xml:space="preserve"> =</w:t>
       </w:r>
@@ -33839,6 +34058,7 @@
           <w:rFonts w:eastAsiaTheme="minorHAnsi"/>
           <w:sz w:val="28"/>
           <w:szCs w:val="28"/>
+          <w:lang w:val="en-US"/>
         </w:rPr>
         <w:t>4</w:t>
       </w:r>
@@ -33847,6 +34067,7 @@
           <w:rFonts w:eastAsiaTheme="minorHAnsi"/>
           <w:sz w:val="28"/>
           <w:szCs w:val="28"/>
+          <w:lang w:val="en-US"/>
         </w:rPr>
         <w:t>.</w:t>
       </w:r>
@@ -33855,6 +34076,7 @@
           <w:rFonts w:eastAsiaTheme="minorHAnsi"/>
           <w:sz w:val="28"/>
           <w:szCs w:val="28"/>
+          <w:lang w:val="en-US"/>
         </w:rPr>
         <w:t>9</w:t>
       </w:r>
@@ -33863,6 +34085,7 @@
           <w:rFonts w:eastAsiaTheme="minorHAnsi"/>
           <w:sz w:val="28"/>
           <w:szCs w:val="28"/>
+          <w:lang w:val="en-US"/>
         </w:rPr>
         <w:t>* Ky</w:t>
       </w:r>
@@ -33880,6 +34103,7 @@
           <w:rFonts w:eastAsiaTheme="minorHAnsi"/>
           <w:sz w:val="28"/>
           <w:szCs w:val="28"/>
+          <w:lang w:val="en-US"/>
         </w:rPr>
       </w:pPr>
       <w:proofErr w:type="spellStart"/>
@@ -33888,6 +34112,7 @@
           <w:rFonts w:eastAsiaTheme="minorHAnsi"/>
           <w:sz w:val="28"/>
           <w:szCs w:val="28"/>
+          <w:lang w:val="en-US"/>
         </w:rPr>
         <w:t>Dw</w:t>
       </w:r>
@@ -33897,6 +34122,7 @@
           <w:rFonts w:eastAsiaTheme="minorHAnsi"/>
           <w:sz w:val="28"/>
           <w:szCs w:val="28"/>
+          <w:lang w:val="en-US"/>
         </w:rPr>
         <w:t xml:space="preserve"> = </w:t>
       </w:r>
@@ -33933,6 +34159,7 @@
                     <w:rFonts w:ascii="Cambria Math" w:eastAsiaTheme="minorHAnsi" w:hAnsi="Cambria Math"/>
                     <w:sz w:val="28"/>
                     <w:szCs w:val="28"/>
+                    <w:lang w:val="en-US"/>
                   </w:rPr>
                   <m:t>2</m:t>
                 </m:r>
@@ -34013,6 +34240,7 @@
           <w:rFonts w:eastAsiaTheme="minorHAnsi"/>
           <w:sz w:val="28"/>
           <w:szCs w:val="28"/>
+          <w:lang w:val="en-US"/>
         </w:rPr>
         <w:t xml:space="preserve"> = </w:t>
       </w:r>
@@ -34049,6 +34277,7 @@
                     <w:rFonts w:ascii="Cambria Math" w:eastAsiaTheme="minorHAnsi" w:hAnsi="Cambria Math"/>
                     <w:sz w:val="28"/>
                     <w:szCs w:val="28"/>
+                    <w:lang w:val="en-US"/>
                   </w:rPr>
                   <m:t>2</m:t>
                 </m:r>
@@ -34062,6 +34291,7 @@
                 <w:rFonts w:ascii="Cambria Math" w:eastAsiaTheme="minorHAnsi" w:hAnsi="Cambria Math"/>
                 <w:sz w:val="28"/>
                 <w:szCs w:val="28"/>
+                <w:lang w:val="en-US"/>
               </w:rPr>
               <m:t xml:space="preserve">*0.55848 </m:t>
             </m:r>
@@ -34075,6 +34305,7 @@
                 <w:rFonts w:ascii="Cambria Math" w:eastAsiaTheme="minorHAnsi" w:hAnsi="Cambria Math"/>
                 <w:sz w:val="28"/>
                 <w:szCs w:val="28"/>
+                <w:lang w:val="en-US"/>
               </w:rPr>
               <m:t>0.00349</m:t>
             </m:r>
@@ -34086,6 +34317,7 @@
           <w:rFonts w:eastAsiaTheme="minorHAnsi"/>
           <w:sz w:val="28"/>
           <w:szCs w:val="28"/>
+          <w:lang w:val="en-US"/>
         </w:rPr>
         <w:t xml:space="preserve"> = </w:t>
       </w:r>
@@ -34094,6 +34326,7 @@
           <w:rFonts w:eastAsiaTheme="minorHAnsi"/>
           <w:sz w:val="28"/>
           <w:szCs w:val="28"/>
+          <w:lang w:val="en-US"/>
         </w:rPr>
         <w:t>226</w:t>
       </w:r>
@@ -34102,6 +34335,7 @@
           <w:rFonts w:eastAsiaTheme="minorHAnsi"/>
           <w:sz w:val="28"/>
           <w:szCs w:val="28"/>
+          <w:lang w:val="en-US"/>
         </w:rPr>
         <w:t>.3</w:t>
       </w:r>
@@ -34119,13 +34353,15 @@
           <w:rFonts w:eastAsiaTheme="minorHAnsi"/>
           <w:sz w:val="28"/>
           <w:szCs w:val="28"/>
-        </w:rPr>
-      </w:pPr>
-      <w:r>
-        <w:rPr>
-          <w:rFonts w:eastAsiaTheme="minorHAnsi"/>
-          <w:sz w:val="28"/>
-          <w:szCs w:val="28"/>
+          <w:lang w:val="en-US"/>
+        </w:rPr>
+      </w:pPr>
+      <w:r>
+        <w:rPr>
+          <w:rFonts w:eastAsiaTheme="minorHAnsi"/>
+          <w:sz w:val="28"/>
+          <w:szCs w:val="28"/>
+          <w:lang w:val="en-US"/>
         </w:rPr>
         <w:t xml:space="preserve">Ky = </w:t>
       </w:r>
@@ -34216,6 +34452,7 @@
                 <w:rFonts w:ascii="Cambria Math" w:eastAsiaTheme="minorHAnsi" w:hAnsi="Cambria Math"/>
                 <w:sz w:val="28"/>
                 <w:szCs w:val="28"/>
+                <w:lang w:val="en-US"/>
               </w:rPr>
               <m:t>*</m:t>
             </m:r>
@@ -34261,6 +34498,7 @@
                 <w:rFonts w:ascii="Cambria Math" w:eastAsiaTheme="minorHAnsi" w:hAnsi="Cambria Math"/>
                 <w:sz w:val="28"/>
                 <w:szCs w:val="28"/>
+                <w:lang w:val="en-US"/>
               </w:rPr>
               <m:t>*</m:t>
             </m:r>
@@ -34306,6 +34544,7 @@
                 <w:rFonts w:ascii="Cambria Math" w:eastAsiaTheme="minorHAnsi" w:hAnsi="Cambria Math"/>
                 <w:sz w:val="28"/>
                 <w:szCs w:val="28"/>
+                <w:lang w:val="en-US"/>
               </w:rPr>
               <m:t>*</m:t>
             </m:r>
@@ -34351,6 +34590,7 @@
           <w:rFonts w:eastAsiaTheme="minorHAnsi"/>
           <w:sz w:val="28"/>
           <w:szCs w:val="28"/>
+          <w:lang w:val="en-US"/>
         </w:rPr>
         <w:t xml:space="preserve"> = </w:t>
       </w:r>
@@ -34374,6 +34614,7 @@
                 <w:rFonts w:ascii="Cambria Math" w:eastAsiaTheme="minorHAnsi" w:hAnsi="Cambria Math"/>
                 <w:sz w:val="28"/>
                 <w:szCs w:val="28"/>
+                <w:lang w:val="en-US"/>
               </w:rPr>
               <m:t>226.3</m:t>
             </m:r>
@@ -34387,6 +34628,7 @@
                 <w:rFonts w:ascii="Cambria Math" w:eastAsiaTheme="minorHAnsi" w:hAnsi="Cambria Math"/>
                 <w:sz w:val="28"/>
                 <w:szCs w:val="28"/>
+                <w:lang w:val="en-US"/>
               </w:rPr>
               <m:t>54.02*39.5*2.4096*0,002*0,477</m:t>
             </m:r>
@@ -34400,6 +34642,7 @@
             <w:rFonts w:ascii="Cambria Math" w:eastAsiaTheme="minorHAnsi" w:hAnsi="Cambria Math"/>
             <w:sz w:val="28"/>
             <w:szCs w:val="28"/>
+            <w:lang w:val="en-US"/>
           </w:rPr>
           <m:t>=</m:t>
         </m:r>
@@ -34409,6 +34652,7 @@
           <w:rFonts w:eastAsiaTheme="minorHAnsi"/>
           <w:sz w:val="28"/>
           <w:szCs w:val="28"/>
+          <w:lang w:val="en-US"/>
         </w:rPr>
         <w:t>46</w:t>
       </w:r>
@@ -34417,6 +34661,7 @@
           <w:rFonts w:eastAsiaTheme="minorHAnsi"/>
           <w:sz w:val="28"/>
           <w:szCs w:val="28"/>
+          <w:lang w:val="en-US"/>
         </w:rPr>
         <w:t>.</w:t>
       </w:r>
@@ -34425,6 +34670,7 @@
           <w:rFonts w:eastAsiaTheme="minorHAnsi"/>
           <w:sz w:val="28"/>
           <w:szCs w:val="28"/>
+          <w:lang w:val="en-US"/>
         </w:rPr>
         <w:t>2</w:t>
       </w:r>
@@ -34693,7 +34939,7 @@
           <w:b w:val="0"/>
         </w:rPr>
       </w:pPr>
-      <w:bookmarkStart w:id="12" w:name="_Toc208186408"/>
+      <w:bookmarkStart w:id="12" w:name="_Toc213703621"/>
       <w:r>
         <w:lastRenderedPageBreak/>
         <w:t>ЗАКЛЮЧЕНИЕ</w:t>
@@ -34949,7 +35195,7 @@
           <w:b w:val="0"/>
         </w:rPr>
       </w:pPr>
-      <w:bookmarkStart w:id="13" w:name="_Toc208186409"/>
+      <w:bookmarkStart w:id="13" w:name="_Toc213703622"/>
       <w:r>
         <w:lastRenderedPageBreak/>
         <w:t>СПИСОК ЛИТЕРАТУРЫ</w:t>
@@ -35377,11 +35623,13 @@
         <w:ind w:left="0"/>
       </w:pPr>
       <w:bookmarkStart w:id="14" w:name="_Toc208255625"/>
+      <w:bookmarkStart w:id="15" w:name="_Toc213703623"/>
       <w:r>
         <w:lastRenderedPageBreak/>
         <w:t>ПРИЛОЖЕНИЕ</w:t>
       </w:r>
       <w:bookmarkEnd w:id="14"/>
+      <w:bookmarkEnd w:id="15"/>
     </w:p>
     <w:p>
       <w:pPr>
@@ -35465,10 +35713,10 @@
         </w:rPr>
         <w:lastRenderedPageBreak/>
         <w:drawing>
-          <wp:inline distT="0" distB="0" distL="0" distR="0" wp14:anchorId="4FFF84E0" wp14:editId="5BEF14CC">
-            <wp:extent cx="6480175" cy="9154160"/>
-            <wp:effectExtent l="0" t="0" r="0" b="8890"/>
-            <wp:docPr id="582625371" name="Рисунок 3"/>
+          <wp:inline distT="0" distB="0" distL="0" distR="0" wp14:anchorId="37FB42D5" wp14:editId="21525EBD">
+            <wp:extent cx="6299835" cy="8895080"/>
+            <wp:effectExtent l="0" t="0" r="5715" b="1270"/>
+            <wp:docPr id="284470084" name="Рисунок 1"/>
             <wp:cNvGraphicFramePr>
               <a:graphicFrameLocks xmlns:a="http://schemas.openxmlformats.org/drawingml/2006/main" noChangeAspect="1"/>
             </wp:cNvGraphicFramePr>
@@ -35476,7 +35724,7 @@
               <a:graphicData uri="http://schemas.openxmlformats.org/drawingml/2006/picture">
                 <pic:pic xmlns:pic="http://schemas.openxmlformats.org/drawingml/2006/picture">
                   <pic:nvPicPr>
-                    <pic:cNvPr id="0" name="Picture 8"/>
+                    <pic:cNvPr id="0" name="Picture 1"/>
                     <pic:cNvPicPr>
                       <a:picLocks noChangeAspect="1" noChangeArrowheads="1"/>
                     </pic:cNvPicPr>
@@ -35497,7 +35745,7 @@
                   <pic:spPr bwMode="auto">
                     <a:xfrm>
                       <a:off x="0" y="0"/>
-                      <a:ext cx="6480175" cy="9154160"/>
+                      <a:ext cx="6299835" cy="8895080"/>
                     </a:xfrm>
                     <a:prstGeom prst="rect">
                       <a:avLst/>

</xml_diff>